<commit_message>
Acomodando el btn de descarga
</commit_message>
<xml_diff>
--- a/PENDIENTES.docx
+++ b/PENDIENTES.docx
@@ -631,9 +631,6 @@
       <w:r>
         <w:t xml:space="preserve"> (debería verse como el de ventasPorVendedor.js)</w:t>
       </w:r>
-      <w:r>
-        <w:br/>
-      </w:r>
     </w:p>
     <w:p>
       <w:pPr>
@@ -648,6 +645,7 @@
           <w:ilvl w:val="0"/>
           <w:numId w:val="1"/>
         </w:numPr>
+        <w:ind w:left="708" w:hanging="424"/>
       </w:pPr>
       <w:r>
         <w:rPr>
@@ -757,6 +755,9 @@
       </w:r>
       <w:r>
         <w:br/>
+      </w:r>
+      <w:r>
+        <w:br/>
         <w:t xml:space="preserve">Arreglar el </w:t>
       </w:r>
       <w:proofErr w:type="spellStart"/>
@@ -783,7 +784,28 @@
       <w:r>
         <w:t xml:space="preserve"> teniendo espacio)</w:t>
       </w:r>
-      <w:r>
+    </w:p>
+    <w:p>
+      <w:pPr>
+        <w:pStyle w:val="Prrafodelista"/>
+      </w:pPr>
+    </w:p>
+    <w:p>
+      <w:pPr>
+        <w:pStyle w:val="Prrafodelista"/>
+        <w:ind w:left="644"/>
+      </w:pPr>
+      <w:r>
+        <w:t>Cuando se sale de la página o se actualiza, debería limpiarse el Título del producto.</w:t>
+      </w:r>
+    </w:p>
+    <w:p>
+      <w:pPr>
+        <w:pStyle w:val="Prrafodelista"/>
+        <w:ind w:left="644"/>
+      </w:pPr>
+      <w:r>
+        <w:lastRenderedPageBreak/>
         <w:br/>
       </w:r>
     </w:p>
@@ -799,7 +821,6 @@
         <w:rPr>
           <w:b/>
         </w:rPr>
-        <w:lastRenderedPageBreak/>
         <w:t>ventas</w:t>
       </w:r>
       <w:r>
@@ -909,8 +930,31 @@
         <w:ind w:left="284"/>
       </w:pPr>
       <w:r>
-        <w:br/>
+        <w:t xml:space="preserve">Falta funcionalidad para buscar la </w:t>
+      </w:r>
+      <w:proofErr w:type="spellStart"/>
+      <w:r>
+        <w:t>info</w:t>
+      </w:r>
+      <w:proofErr w:type="spellEnd"/>
+      <w:r>
+        <w:t xml:space="preserve"> </w:t>
+      </w:r>
+      <w:r>
+        <w:br/>
+      </w:r>
+      <w:r>
+        <w:rPr>
+          <w:strike/>
+          <w:highlight w:val="yellow"/>
+        </w:rPr>
         <w:t>Corregir notificaciones</w:t>
+      </w:r>
+      <w:r>
+        <w:rPr>
+          <w:strike/>
+        </w:rPr>
+        <w:t xml:space="preserve"> </w:t>
       </w:r>
       <w:r>
         <w:br/>
@@ -921,7 +965,7 @@
           <w:lang w:eastAsia="es-AR"/>
         </w:rPr>
         <w:drawing>
-          <wp:inline distT="0" distB="0" distL="0" distR="0" wp14:anchorId="7CE77869" wp14:editId="57034743">
+          <wp:inline distT="0" distB="0" distL="0" distR="0" wp14:anchorId="4E68A8F3" wp14:editId="202651E3">
             <wp:extent cx="1264024" cy="1669998"/>
             <wp:effectExtent l="0" t="0" r="0" b="6985"/>
             <wp:docPr id="5" name="Imagen 5"/>
@@ -1126,7 +1170,10 @@
         <w:br/>
       </w:r>
       <w:r>
-        <w:t xml:space="preserve">Falta </w:t>
+        <w:t xml:space="preserve">FALTA </w:t>
+      </w:r>
+      <w:r>
+        <w:t xml:space="preserve"> </w:t>
       </w:r>
       <w:proofErr w:type="spellStart"/>
       <w:r>
@@ -1214,6 +1261,11 @@
       </w:r>
       <w:r>
         <w:br/>
+      </w:r>
+      <w:r>
+        <w:rPr>
+          <w:strike/>
+        </w:rPr>
         <w:t>(El icono debe ser como el de las VentasPorVendedor.js)</w:t>
       </w:r>
     </w:p>
@@ -1538,6 +1590,12 @@
       <w:proofErr w:type="spellEnd"/>
       <w:r>
         <w:t xml:space="preserve"> para que el usuario edite lo que quiera</w:t>
+      </w:r>
+      <w:r>
+        <w:br/>
+      </w:r>
+      <w:r>
+        <w:t>Agregar cartel de “Guardado Exitoso”</w:t>
       </w:r>
       <w:r>
         <w:br/>
@@ -1756,6 +1814,34 @@
       </w:r>
       <w:r>
         <w:br/>
+        <w:t>La cabecera del cuadro (</w:t>
+      </w:r>
+      <w:proofErr w:type="spellStart"/>
+      <w:r>
+        <w:t>cant</w:t>
+      </w:r>
+      <w:proofErr w:type="spellEnd"/>
+      <w:r>
+        <w:t xml:space="preserve"> – producto – costo) tendría que tener un color de fondo diferente al </w:t>
+      </w:r>
+      <w:proofErr w:type="spellStart"/>
+      <w:r>
+        <w:t>background</w:t>
+      </w:r>
+      <w:proofErr w:type="spellEnd"/>
+      <w:r>
+        <w:t xml:space="preserve"> del </w:t>
+      </w:r>
+      <w:proofErr w:type="spellStart"/>
+      <w:r>
+        <w:t>body</w:t>
+      </w:r>
+      <w:proofErr w:type="spellEnd"/>
+      <w:r>
+        <w:t>)</w:t>
+      </w:r>
+      <w:r>
+        <w:br/>
         <w:t>Así debería verse:</w:t>
       </w:r>
       <w:r>
@@ -1778,27 +1864,30 @@
         </w:numPr>
       </w:pPr>
       <w:r>
+        <w:t>Al presionar</w:t>
+      </w:r>
+      <w:r>
+        <w:t xml:space="preserve"> el </w:t>
+      </w:r>
+      <w:proofErr w:type="spellStart"/>
+      <w:r>
+        <w:t>btn</w:t>
+      </w:r>
+      <w:proofErr w:type="spellEnd"/>
+      <w:r>
+        <w:t xml:space="preserve"> </w:t>
+      </w:r>
+      <w:proofErr w:type="spellStart"/>
+      <w:r>
+        <w:t>AgregarManualmente</w:t>
+      </w:r>
+      <w:proofErr w:type="spellEnd"/>
+      <w:r>
+        <w:t xml:space="preserve">, debería abrirse un buscador para </w:t>
+      </w:r>
+      <w:r>
         <w:lastRenderedPageBreak/>
-        <w:t>Al presionar</w:t>
-      </w:r>
-      <w:r>
-        <w:t xml:space="preserve"> el </w:t>
-      </w:r>
-      <w:proofErr w:type="spellStart"/>
-      <w:r>
-        <w:t>btn</w:t>
-      </w:r>
-      <w:proofErr w:type="spellEnd"/>
-      <w:r>
-        <w:t xml:space="preserve"> </w:t>
-      </w:r>
-      <w:proofErr w:type="spellStart"/>
-      <w:r>
-        <w:t>AgregarManualmente</w:t>
-      </w:r>
-      <w:proofErr w:type="spellEnd"/>
-      <w:r>
-        <w:t>, debería abrirse un buscador para que elija el nombre del producto.</w:t>
+        <w:t>que elija el nombre del producto.</w:t>
       </w:r>
       <w:r>
         <w:br/>
@@ -1929,6 +2018,36 @@
         </w:drawing>
       </w:r>
       <w:r>
+        <w:t xml:space="preserve"> </w:t>
+      </w:r>
+      <w:r>
+        <w:t>La cabecera del cuadro (</w:t>
+      </w:r>
+      <w:proofErr w:type="spellStart"/>
+      <w:r>
+        <w:t>cant</w:t>
+      </w:r>
+      <w:proofErr w:type="spellEnd"/>
+      <w:r>
+        <w:t xml:space="preserve"> – producto – costo) tendría que tener un color de fondo diferente al </w:t>
+      </w:r>
+      <w:proofErr w:type="spellStart"/>
+      <w:r>
+        <w:t>background</w:t>
+      </w:r>
+      <w:proofErr w:type="spellEnd"/>
+      <w:r>
+        <w:t xml:space="preserve"> del </w:t>
+      </w:r>
+      <w:proofErr w:type="spellStart"/>
+      <w:r>
+        <w:t>body</w:t>
+      </w:r>
+      <w:proofErr w:type="spellEnd"/>
+      <w:r>
+        <w:t>)</w:t>
+      </w:r>
+      <w:r>
         <w:rPr>
           <w:b/>
         </w:rPr>
@@ -2116,46 +2235,47 @@
         </w:rPr>
         <w:t xml:space="preserve"> y el “Nombre”</w:t>
       </w:r>
+    </w:p>
+    <w:p>
+      <w:pPr>
+        <w:pStyle w:val="Prrafodelista"/>
+        <w:ind w:left="644"/>
+      </w:pPr>
+      <w:r>
+        <w:t xml:space="preserve">Faltan el </w:t>
+      </w:r>
+      <w:proofErr w:type="spellStart"/>
+      <w:r>
+        <w:t>footer</w:t>
+      </w:r>
+      <w:proofErr w:type="spellEnd"/>
+      <w:r>
+        <w:t xml:space="preserve"> con los </w:t>
+      </w:r>
+      <w:proofErr w:type="spellStart"/>
+      <w:r>
+        <w:t>btns</w:t>
+      </w:r>
+      <w:proofErr w:type="spellEnd"/>
+      <w:r>
+        <w:t xml:space="preserve"> “cancelar” “guardar”</w:t>
+      </w:r>
+    </w:p>
+    <w:p>
+      <w:pPr>
+        <w:pStyle w:val="Prrafodelista"/>
+        <w:ind w:left="644"/>
+      </w:pPr>
+    </w:p>
+    <w:p/>
+    <w:p/>
+    <w:p>
       <w:bookmarkStart w:id="0" w:name="_GoBack"/>
       <w:bookmarkEnd w:id="0"/>
     </w:p>
-    <w:p>
-      <w:pPr>
-        <w:pStyle w:val="Prrafodelista"/>
-        <w:ind w:left="644"/>
-      </w:pPr>
-      <w:r>
-        <w:t xml:space="preserve">Faltan el </w:t>
-      </w:r>
-      <w:proofErr w:type="spellStart"/>
-      <w:r>
-        <w:t>footer</w:t>
-      </w:r>
-      <w:proofErr w:type="spellEnd"/>
-      <w:r>
-        <w:t xml:space="preserve"> con los </w:t>
-      </w:r>
-      <w:proofErr w:type="spellStart"/>
-      <w:r>
-        <w:t>btns</w:t>
-      </w:r>
-      <w:proofErr w:type="spellEnd"/>
-      <w:r>
-        <w:t xml:space="preserve"> “cancelar” “guardar”</w:t>
-      </w:r>
-    </w:p>
-    <w:p>
-      <w:pPr>
-        <w:pStyle w:val="Prrafodelista"/>
-        <w:ind w:left="644"/>
-      </w:pPr>
-    </w:p>
-    <w:p/>
-    <w:p/>
-    <w:p/>
     <w:sectPr>
       <w:pgSz w:w="11906" w:h="16838"/>
-      <w:pgMar w:top="567" w:right="1701" w:bottom="1135" w:left="1134" w:header="708" w:footer="708" w:gutter="0"/>
+      <w:pgMar w:top="567" w:right="1701" w:bottom="568" w:left="1134" w:header="708" w:footer="708" w:gutter="0"/>
       <w:cols w:space="708"/>
       <w:docGrid w:linePitch="360"/>
     </w:sectPr>

</xml_diff>

<commit_message>
Arreglé vista de pág. ventaActual.js
</commit_message>
<xml_diff>
--- a/PENDIENTES.docx
+++ b/PENDIENTES.docx
@@ -255,6 +255,7 @@
       <w:r>
         <w:rPr>
           <w:b/>
+          <w:strike/>
         </w:rPr>
         <w:t>venderBuscador</w:t>
       </w:r>
@@ -280,43 +281,75 @@
         <w:t>ventaactual</w:t>
       </w:r>
       <w:r>
-        <w:t>.js: poner los</w:t>
-      </w:r>
-      <w:r>
+        <w:t xml:space="preserve">.js: </w:t>
+      </w:r>
+      <w:r>
+        <w:rPr>
+          <w:strike/>
+        </w:rPr>
+        <w:t>poner los</w:t>
+      </w:r>
+      <w:r>
+        <w:rPr>
+          <w:strike/>
+        </w:rPr>
         <w:t xml:space="preserve"> </w:t>
       </w:r>
       <w:proofErr w:type="spellStart"/>
       <w:r>
+        <w:rPr>
+          <w:strike/>
+        </w:rPr>
         <w:t>btns</w:t>
       </w:r>
       <w:proofErr w:type="spellEnd"/>
       <w:r>
+        <w:rPr>
+          <w:strike/>
+        </w:rPr>
         <w:t xml:space="preserve"> en el </w:t>
       </w:r>
       <w:proofErr w:type="spellStart"/>
       <w:r>
+        <w:rPr>
+          <w:strike/>
+        </w:rPr>
         <w:t>footer</w:t>
       </w:r>
       <w:proofErr w:type="spellEnd"/>
       <w:r>
+        <w:rPr>
+          <w:strike/>
+        </w:rPr>
         <w:t xml:space="preserve"> (que no se superpongan al </w:t>
       </w:r>
       <w:proofErr w:type="spellStart"/>
       <w:r>
+        <w:rPr>
+          <w:strike/>
+        </w:rPr>
         <w:t>main</w:t>
       </w:r>
       <w:proofErr w:type="spellEnd"/>
       <w:r>
+        <w:rPr>
+          <w:strike/>
+        </w:rPr>
         <w:t xml:space="preserve">), en la versión que está en componentes no veo el </w:t>
       </w:r>
       <w:proofErr w:type="spellStart"/>
       <w:r>
+        <w:rPr>
+          <w:strike/>
+        </w:rPr>
         <w:t>footer</w:t>
       </w:r>
       <w:proofErr w:type="spellEnd"/>
       <w:r>
         <w:t>.</w:t>
       </w:r>
+      <w:bookmarkStart w:id="0" w:name="_GoBack"/>
+      <w:bookmarkEnd w:id="0"/>
       <w:r>
         <w:br/>
       </w:r>
@@ -2269,10 +2302,7 @@
     </w:p>
     <w:p/>
     <w:p/>
-    <w:p>
-      <w:bookmarkStart w:id="0" w:name="_GoBack"/>
-      <w:bookmarkEnd w:id="0"/>
-    </w:p>
+    <w:p/>
     <w:sectPr>
       <w:pgSz w:w="11906" w:h="16838"/>
       <w:pgMar w:top="567" w:right="1701" w:bottom="568" w:left="1134" w:header="708" w:footer="708" w:gutter="0"/>

</xml_diff>

<commit_message>
Agregué btnDescargar a páginas Ventas,stock,stockbajo,stocksinmvto
</commit_message>
<xml_diff>
--- a/PENDIENTES.docx
+++ b/PENDIENTES.docx
@@ -367,22 +367,40 @@
         <w:t>ventasdeldia</w:t>
       </w:r>
       <w:r>
-        <w:t xml:space="preserve">.js: poner el BTN de descarga en el </w:t>
-      </w:r>
-      <w:proofErr w:type="spellStart"/>
-      <w:r>
+        <w:t xml:space="preserve">.js: </w:t>
+      </w:r>
+      <w:r>
+        <w:rPr>
+          <w:strike/>
+        </w:rPr>
+        <w:t xml:space="preserve">poner el BTN de descarga en el </w:t>
+      </w:r>
+      <w:proofErr w:type="spellStart"/>
+      <w:r>
+        <w:rPr>
+          <w:strike/>
+        </w:rPr>
         <w:t>Footer</w:t>
       </w:r>
       <w:proofErr w:type="spellEnd"/>
       <w:r>
+        <w:rPr>
+          <w:strike/>
+        </w:rPr>
         <w:t xml:space="preserve"> (separado del </w:t>
       </w:r>
       <w:proofErr w:type="spellStart"/>
       <w:r>
+        <w:rPr>
+          <w:strike/>
+        </w:rPr>
         <w:t>main</w:t>
       </w:r>
       <w:proofErr w:type="spellEnd"/>
       <w:r>
+        <w:rPr>
+          <w:strike/>
+        </w:rPr>
         <w:t>)</w:t>
       </w:r>
       <w:r>
@@ -399,6 +417,11 @@
       </w:r>
       <w:r>
         <w:br/>
+      </w:r>
+      <w:r>
+        <w:rPr>
+          <w:strike/>
+        </w:rPr>
         <w:t>Función para descargar</w:t>
       </w:r>
     </w:p>
@@ -409,11 +432,12 @@
       </w:pPr>
       <w:r>
         <w:rPr>
+          <w:strike/>
           <w:noProof/>
           <w:lang w:eastAsia="es-AR"/>
         </w:rPr>
         <w:drawing>
-          <wp:anchor distT="0" distB="0" distL="114300" distR="114300" simplePos="0" relativeHeight="251659264" behindDoc="0" locked="0" layoutInCell="1" allowOverlap="1" wp14:anchorId="3CF57B90" wp14:editId="30921DE7">
+          <wp:anchor distT="0" distB="0" distL="114300" distR="114300" simplePos="0" relativeHeight="251659264" behindDoc="0" locked="0" layoutInCell="1" allowOverlap="1" wp14:anchorId="46916489" wp14:editId="52CAC8B7">
             <wp:simplePos x="0" y="0"/>
             <wp:positionH relativeFrom="column">
               <wp:posOffset>4065905</wp:posOffset>
@@ -476,16 +500,31 @@
         </w:drawing>
       </w:r>
       <w:r>
+        <w:rPr>
+          <w:strike/>
+        </w:rPr>
         <w:t>Si se descargó</w:t>
       </w:r>
       <w:r>
+        <w:rPr>
+          <w:strike/>
+        </w:rPr>
         <w:t xml:space="preserve"> el archivo</w:t>
       </w:r>
       <w:r>
+        <w:rPr>
+          <w:strike/>
+        </w:rPr>
         <w:t xml:space="preserve">, debe salir una notificación confirmando y sino otra notificación </w:t>
       </w:r>
       <w:r>
-        <w:t>avisando que hubo un problema.</w:t>
+        <w:rPr>
+          <w:strike/>
+        </w:rPr>
+        <w:t>avisando que hubo un problema</w:t>
+      </w:r>
+      <w:r>
+        <w:t>.</w:t>
       </w:r>
       <w:r>
         <w:br/>
@@ -824,11 +863,23 @@
       </w:r>
       <w:r>
         <w:br/>
-        <w:t>b) si falta la fecha en DESDE</w:t>
-      </w:r>
-      <w:r>
-        <w:br/>
-        <w:t>c) si falta seleccionar un producto</w:t>
+        <w:t xml:space="preserve">b) </w:t>
+      </w:r>
+      <w:r>
+        <w:rPr>
+          <w:strike/>
+        </w:rPr>
+        <w:t>si falta la fecha en DESDE</w:t>
+      </w:r>
+      <w:r>
+        <w:br/>
+        <w:t>c</w:t>
+      </w:r>
+      <w:r>
+        <w:rPr>
+          <w:strike/>
+        </w:rPr>
+        <w:t>) si falta seleccionar un producto</w:t>
       </w:r>
       <w:r>
         <w:br/>
@@ -841,40 +892,67 @@
       <w:proofErr w:type="spellEnd"/>
       <w:r>
         <w:br/>
-        <w:t>e) si no se vendió ese producto en esas fechas</w:t>
-      </w:r>
-      <w:r>
-        <w:br/>
-      </w:r>
-      <w:r>
-        <w:br/>
-      </w:r>
-      <w:r>
+        <w:t xml:space="preserve">e) </w:t>
+      </w:r>
+      <w:r>
+        <w:rPr>
+          <w:strike/>
+        </w:rPr>
+        <w:t>si no se vendió ese producto en esas fechas</w:t>
+      </w:r>
+      <w:r>
+        <w:br/>
+      </w:r>
+      <w:r>
+        <w:br/>
+      </w:r>
+      <w:r>
+        <w:rPr>
+          <w:strike/>
+        </w:rPr>
         <w:lastRenderedPageBreak/>
         <w:t xml:space="preserve">Arreglar el </w:t>
       </w:r>
       <w:proofErr w:type="spellStart"/>
       <w:r>
+        <w:rPr>
+          <w:strike/>
+        </w:rPr>
         <w:t>btn</w:t>
       </w:r>
       <w:proofErr w:type="spellEnd"/>
       <w:r>
+        <w:rPr>
+          <w:strike/>
+        </w:rPr>
         <w:t xml:space="preserve"> cargar, queda fuera de la </w:t>
       </w:r>
       <w:proofErr w:type="spellStart"/>
       <w:r>
+        <w:rPr>
+          <w:strike/>
+        </w:rPr>
         <w:t>viewport</w:t>
       </w:r>
       <w:proofErr w:type="spellEnd"/>
       <w:r>
+        <w:rPr>
+          <w:strike/>
+        </w:rPr>
         <w:t xml:space="preserve"> (</w:t>
       </w:r>
       <w:proofErr w:type="spellStart"/>
       <w:r>
+        <w:rPr>
+          <w:strike/>
+        </w:rPr>
         <w:t>aún</w:t>
       </w:r>
       <w:proofErr w:type="spellEnd"/>
       <w:r>
+        <w:rPr>
+          <w:strike/>
+        </w:rPr>
         <w:t xml:space="preserve"> teniendo espacio)</w:t>
       </w:r>
     </w:p>
@@ -887,9 +965,29 @@
       <w:pPr>
         <w:pStyle w:val="Prrafodelista"/>
         <w:ind w:left="644"/>
-      </w:pPr>
-      <w:r>
-        <w:t>Cuando se sale de la página o se actualiza, debería limpiarse el Título del producto.</w:t>
+        <w:rPr>
+          <w:u w:val="single"/>
+        </w:rPr>
+      </w:pPr>
+      <w:r>
+        <w:t xml:space="preserve">Cuando </w:t>
+      </w:r>
+      <w:r>
+        <w:t>retrocedo</w:t>
+      </w:r>
+      <w:r>
+        <w:t>, debería limpiarse el Título del producto.</w:t>
+      </w:r>
+      <w:r>
+        <w:t xml:space="preserve"> (</w:t>
+      </w:r>
+      <w:proofErr w:type="gramStart"/>
+      <w:r>
+        <w:t>actualmente</w:t>
+      </w:r>
+      <w:proofErr w:type="gramEnd"/>
+      <w:r>
+        <w:t xml:space="preserve"> funciona bien si se actualiza la pág.)</w:t>
       </w:r>
     </w:p>
     <w:p>
@@ -1263,18 +1361,47 @@
         <w:br/>
       </w:r>
       <w:r>
+        <w:rPr>
+          <w:strike/>
+        </w:rPr>
         <w:t xml:space="preserve">FALTA </w:t>
       </w:r>
       <w:r>
+        <w:rPr>
+          <w:strike/>
+        </w:rPr>
         <w:t xml:space="preserve"> </w:t>
       </w:r>
       <w:proofErr w:type="spellStart"/>
       <w:r>
+        <w:rPr>
+          <w:strike/>
+        </w:rPr>
         <w:t>btn</w:t>
       </w:r>
       <w:proofErr w:type="spellEnd"/>
       <w:r>
-        <w:t xml:space="preserve"> descarga y hacer las funcionalidades.</w:t>
+        <w:rPr>
+          <w:strike/>
+        </w:rPr>
+        <w:t xml:space="preserve"> descarga</w:t>
+      </w:r>
+      <w:r>
+        <w:t xml:space="preserve"> y </w:t>
+      </w:r>
+      <w:r>
+        <w:t xml:space="preserve">FALTA  </w:t>
+      </w:r>
+      <w:r>
+        <w:t xml:space="preserve">las funcionalidades de filtrado y traer </w:t>
+      </w:r>
+      <w:proofErr w:type="spellStart"/>
+      <w:r>
+        <w:t>info</w:t>
+      </w:r>
+      <w:proofErr w:type="spellEnd"/>
+      <w:r>
+        <w:t xml:space="preserve"> de BBDD</w:t>
       </w:r>
       <w:r>
         <w:br/>
@@ -1315,6 +1442,8 @@
       <w:r>
         <w:t>.js</w:t>
       </w:r>
+      <w:bookmarkStart w:id="0" w:name="_GoBack"/>
+      <w:bookmarkEnd w:id="0"/>
     </w:p>
     <w:p>
       <w:pPr>
@@ -2296,8 +2425,6 @@
       <w:r>
         <w:t xml:space="preserve"> “cancelar” “guardar”</w:t>
       </w:r>
-      <w:bookmarkStart w:id="0" w:name="_GoBack"/>
-      <w:bookmarkEnd w:id="0"/>
       <w:r>
         <w:br/>
       </w:r>

</xml_diff>

<commit_message>
unificando btn flotantes y otros del footer
</commit_message>
<xml_diff>
--- a/PENDIENTES.docx
+++ b/PENDIENTES.docx
@@ -721,7 +721,18 @@
       </w:r>
       <w:r>
         <w:br/>
-        <w:t>El icono del “calendario” debería ser blanco.</w:t>
+      </w:r>
+      <w:r>
+        <w:rPr>
+          <w:strike/>
+        </w:rPr>
+        <w:t xml:space="preserve">El icono del </w:t>
+      </w:r>
+      <w:r>
+        <w:rPr>
+          <w:strike/>
+        </w:rPr>
+        <w:t>“calendario” debería ser blanco o cambiar fondo</w:t>
       </w:r>
       <w:r>
         <w:br/>
@@ -859,7 +870,16 @@
         <w:br/>
       </w:r>
       <w:r>
-        <w:t xml:space="preserve">a) cuando la segunda fecha (hasta) es anterior a la primera (desde). </w:t>
+        <w:t xml:space="preserve">a) </w:t>
+      </w:r>
+      <w:r>
+        <w:rPr>
+          <w:strike/>
+        </w:rPr>
+        <w:t>cuando la segunda fecha (hasta) es anterior a la primera (desde).</w:t>
+      </w:r>
+      <w:r>
+        <w:t xml:space="preserve"> </w:t>
       </w:r>
       <w:r>
         <w:br/>
@@ -966,28 +986,53 @@
         <w:pStyle w:val="Prrafodelista"/>
         <w:ind w:left="644"/>
         <w:rPr>
+          <w:strike/>
           <w:u w:val="single"/>
         </w:rPr>
       </w:pPr>
       <w:r>
+        <w:rPr>
+          <w:strike/>
+        </w:rPr>
         <w:t xml:space="preserve">Cuando </w:t>
       </w:r>
       <w:r>
+        <w:rPr>
+          <w:strike/>
+        </w:rPr>
         <w:t>retrocedo</w:t>
       </w:r>
       <w:r>
+        <w:rPr>
+          <w:strike/>
+        </w:rPr>
         <w:t>, debería limpiarse el Título del producto.</w:t>
       </w:r>
       <w:r>
+        <w:rPr>
+          <w:strike/>
+        </w:rPr>
         <w:t xml:space="preserve"> (</w:t>
       </w:r>
       <w:proofErr w:type="gramStart"/>
       <w:r>
+        <w:rPr>
+          <w:strike/>
+        </w:rPr>
         <w:t>actualmente</w:t>
       </w:r>
       <w:proofErr w:type="gramEnd"/>
       <w:r>
-        <w:t xml:space="preserve"> funciona bien si se actualiza la pág.)</w:t>
+        <w:rPr>
+          <w:strike/>
+        </w:rPr>
+        <w:t xml:space="preserve"> funciona bien si se </w:t>
+      </w:r>
+      <w:r>
+        <w:rPr>
+          <w:strike/>
+        </w:rPr>
+        <w:t>actualiza la pág.)</w:t>
       </w:r>
     </w:p>
     <w:p>
@@ -1006,41 +1051,72 @@
           <w:ilvl w:val="0"/>
           <w:numId w:val="1"/>
         </w:numPr>
-      </w:pPr>
-      <w:r>
-        <w:rPr>
-          <w:b/>
+        <w:rPr>
+          <w:highlight w:val="yellow"/>
+        </w:rPr>
+      </w:pPr>
+      <w:r>
+        <w:rPr>
+          <w:b/>
+          <w:highlight w:val="green"/>
         </w:rPr>
         <w:t>ventas</w:t>
       </w:r>
       <w:r>
         <w:rPr>
           <w:b/>
+          <w:highlight w:val="green"/>
         </w:rPr>
         <w:t>xprodxfecha</w:t>
       </w:r>
       <w:r>
-        <w:t>.</w:t>
-      </w:r>
-      <w:r>
-        <w:t>js:</w:t>
-      </w:r>
-      <w:r>
-        <w:br/>
-      </w:r>
-      <w:r>
+        <w:rPr>
+          <w:highlight w:val="green"/>
+        </w:rPr>
+        <w:t>.js:</w:t>
+      </w:r>
+      <w:r>
+        <w:rPr>
+          <w:highlight w:val="green"/>
+        </w:rPr>
+        <w:br/>
+      </w:r>
+      <w:r>
+        <w:rPr>
+          <w:highlight w:val="green"/>
+        </w:rPr>
         <w:t xml:space="preserve">-ver con Lu, porque a mí sólo me aparece el </w:t>
       </w:r>
       <w:proofErr w:type="spellStart"/>
       <w:r>
+        <w:rPr>
+          <w:highlight w:val="green"/>
+        </w:rPr>
         <w:t>header</w:t>
       </w:r>
       <w:proofErr w:type="spellEnd"/>
       <w:r>
-        <w:br/>
+        <w:rPr>
+          <w:highlight w:val="green"/>
+        </w:rPr>
+        <w:br/>
+      </w:r>
+      <w:r>
         <w:t>-Debería verse así:</w:t>
       </w:r>
       <w:r>
+        <w:t xml:space="preserve">                         y así es como se ve en mi pc</w:t>
+      </w:r>
+      <w:r>
+        <w:t xml:space="preserve"> (se repite)</w:t>
+      </w:r>
+      <w:r>
+        <w:t>:</w:t>
+      </w:r>
+      <w:r>
+        <w:rPr>
+          <w:highlight w:val="yellow"/>
+        </w:rPr>
         <w:br/>
       </w:r>
     </w:p>
@@ -1090,75 +1166,15 @@
           </wp:inline>
         </w:drawing>
       </w:r>
-    </w:p>
-    <w:p>
-      <w:pPr>
-        <w:pStyle w:val="Prrafodelista"/>
-        <w:ind w:left="644"/>
-      </w:pPr>
-    </w:p>
-    <w:p>
-      <w:pPr>
-        <w:pStyle w:val="Prrafodelista"/>
-        <w:numPr>
-          <w:ilvl w:val="0"/>
-          <w:numId w:val="1"/>
-        </w:numPr>
-      </w:pPr>
-      <w:r>
-        <w:rPr>
-          <w:b/>
-        </w:rPr>
-        <w:t>ventasPorFechaPage</w:t>
-      </w:r>
-      <w:r>
-        <w:t>.js:</w:t>
-      </w:r>
-    </w:p>
-    <w:p>
-      <w:pPr>
-        <w:ind w:left="284"/>
-      </w:pPr>
-      <w:r>
-        <w:t xml:space="preserve">Falta funcionalidad para buscar la </w:t>
-      </w:r>
-      <w:proofErr w:type="spellStart"/>
-      <w:r>
-        <w:t>info</w:t>
-      </w:r>
-      <w:proofErr w:type="spellEnd"/>
-      <w:r>
-        <w:t xml:space="preserve"> </w:t>
-      </w:r>
-      <w:r>
-        <w:br/>
-      </w:r>
-      <w:r>
-        <w:rPr>
-          <w:strike/>
-          <w:highlight w:val="yellow"/>
-        </w:rPr>
-        <w:t>Corregir notificaciones</w:t>
-      </w:r>
-      <w:r>
-        <w:rPr>
-          <w:strike/>
-        </w:rPr>
-        <w:t xml:space="preserve"> </w:t>
-      </w:r>
-      <w:r>
-        <w:br/>
-      </w:r>
-      <w:r>
-        <w:rPr>
-          <w:noProof/>
-          <w:lang w:eastAsia="es-AR"/>
-        </w:rPr>
+      <w:r>
+        <w:t xml:space="preserve">                         </w:t>
+      </w:r>
+      <w:r>
         <w:drawing>
-          <wp:inline distT="0" distB="0" distL="0" distR="0" wp14:anchorId="4E68A8F3" wp14:editId="202651E3">
-            <wp:extent cx="1264024" cy="1669998"/>
-            <wp:effectExtent l="0" t="0" r="0" b="6985"/>
-            <wp:docPr id="5" name="Imagen 5"/>
+          <wp:inline distT="0" distB="0" distL="0" distR="0" wp14:anchorId="2CF08F0D" wp14:editId="23ACA171">
+            <wp:extent cx="1246909" cy="1824424"/>
+            <wp:effectExtent l="0" t="0" r="0" b="4445"/>
+            <wp:docPr id="13" name="Imagen 13"/>
             <wp:cNvGraphicFramePr>
               <a:graphicFrameLocks xmlns:a="http://schemas.openxmlformats.org/drawingml/2006/main" noChangeAspect="1"/>
             </wp:cNvGraphicFramePr>
@@ -1170,13 +1186,7 @@
                     <pic:cNvPicPr/>
                   </pic:nvPicPr>
                   <pic:blipFill>
-                    <a:blip r:embed="rId10" cstate="print">
-                      <a:extLst>
-                        <a:ext uri="{28A0092B-C50C-407E-A947-70E740481C1C}">
-                          <a14:useLocalDpi xmlns:a14="http://schemas.microsoft.com/office/drawing/2010/main" val="0"/>
-                        </a:ext>
-                      </a:extLst>
-                    </a:blip>
+                    <a:blip r:embed="rId10"/>
                     <a:stretch>
                       <a:fillRect/>
                     </a:stretch>
@@ -1184,7 +1194,7 @@
                   <pic:spPr>
                     <a:xfrm>
                       <a:off x="0" y="0"/>
-                      <a:ext cx="1264752" cy="1670960"/>
+                      <a:ext cx="1246909" cy="1824424"/>
                     </a:xfrm>
                     <a:prstGeom prst="rect">
                       <a:avLst/>
@@ -1213,22 +1223,58 @@
       </w:pPr>
       <w:r>
         <w:rPr>
+          <w:b/>
+        </w:rPr>
+        <w:t>ventasPorFechaPage</w:t>
+      </w:r>
+      <w:r>
+        <w:t>.js:</w:t>
+      </w:r>
+    </w:p>
+    <w:p>
+      <w:pPr>
+        <w:ind w:left="284"/>
+      </w:pPr>
+      <w:r>
+        <w:t xml:space="preserve">Falta funcionalidad para buscar la </w:t>
+      </w:r>
+      <w:proofErr w:type="spellStart"/>
+      <w:r>
+        <w:t>info</w:t>
+      </w:r>
+      <w:proofErr w:type="spellEnd"/>
+      <w:r>
+        <w:t xml:space="preserve"> </w:t>
+      </w:r>
+      <w:r>
+        <w:br/>
+      </w:r>
+      <w:r>
+        <w:rPr>
+          <w:strike/>
+          <w:highlight w:val="yellow"/>
+        </w:rPr>
+        <w:t>Corregir notificaciones</w:t>
+      </w:r>
+      <w:r>
+        <w:rPr>
+          <w:strike/>
+        </w:rPr>
+        <w:t xml:space="preserve"> </w:t>
+      </w:r>
+      <w:r>
+        <w:br/>
+      </w:r>
+      <w:r>
+        <w:rPr>
           <w:noProof/>
           <w:lang w:eastAsia="es-AR"/>
         </w:rPr>
         <w:drawing>
-          <wp:anchor distT="0" distB="0" distL="114300" distR="114300" simplePos="0" relativeHeight="251661312" behindDoc="0" locked="0" layoutInCell="1" allowOverlap="1" wp14:anchorId="5AF4678B" wp14:editId="6D351390">
-            <wp:simplePos x="0" y="0"/>
-            <wp:positionH relativeFrom="column">
-              <wp:posOffset>2891790</wp:posOffset>
-            </wp:positionH>
-            <wp:positionV relativeFrom="paragraph">
-              <wp:posOffset>645795</wp:posOffset>
-            </wp:positionV>
-            <wp:extent cx="1725295" cy="2178050"/>
-            <wp:effectExtent l="0" t="0" r="8255" b="0"/>
-            <wp:wrapSquare wrapText="bothSides"/>
-            <wp:docPr id="7" name="Imagen 7"/>
+          <wp:inline distT="0" distB="0" distL="0" distR="0" wp14:anchorId="664805AE" wp14:editId="740EDF77">
+            <wp:extent cx="1264024" cy="1669998"/>
+            <wp:effectExtent l="0" t="0" r="0" b="6985"/>
+            <wp:docPr id="5" name="Imagen 5"/>
             <wp:cNvGraphicFramePr>
               <a:graphicFrameLocks xmlns:a="http://schemas.openxmlformats.org/drawingml/2006/main" noChangeAspect="1"/>
             </wp:cNvGraphicFramePr>
@@ -1254,7 +1300,7 @@
                   <pic:spPr>
                     <a:xfrm>
                       <a:off x="0" y="0"/>
-                      <a:ext cx="1725295" cy="2178050"/>
+                      <a:ext cx="1264752" cy="1670960"/>
                     </a:xfrm>
                     <a:prstGeom prst="rect">
                       <a:avLst/>
@@ -1263,15 +1309,18 @@
                 </pic:pic>
               </a:graphicData>
             </a:graphic>
-            <wp14:sizeRelH relativeFrom="page">
-              <wp14:pctWidth>0</wp14:pctWidth>
-            </wp14:sizeRelH>
-            <wp14:sizeRelV relativeFrom="page">
-              <wp14:pctHeight>0</wp14:pctHeight>
-            </wp14:sizeRelV>
-          </wp:anchor>
+          </wp:inline>
         </w:drawing>
       </w:r>
+    </w:p>
+    <w:p>
+      <w:pPr>
+        <w:pStyle w:val="Prrafodelista"/>
+        <w:numPr>
+          <w:ilvl w:val="0"/>
+          <w:numId w:val="1"/>
+        </w:numPr>
+      </w:pPr>
       <w:r>
         <w:rPr>
           <w:b/>
@@ -1282,47 +1331,273 @@
         <w:t>.js:</w:t>
       </w:r>
       <w:r>
-        <w:br/>
-        <w:t>icono de calendario debe ser blanco</w:t>
-      </w:r>
-      <w:r>
-        <w:br/>
-      </w:r>
-      <w:r>
-        <w:t>Debería verse así:</w:t>
-      </w:r>
-      <w:r>
         <w:tab/>
       </w:r>
       <w:r>
-        <w:tab/>
-      </w:r>
-      <w:r>
-        <w:tab/>
-      </w:r>
-      <w:r>
-        <w:t>Así se ve:</w:t>
-      </w:r>
-      <w:r>
-        <w:tab/>
-      </w:r>
-      <w:r>
-        <w:tab/>
-      </w:r>
-      <w:r>
-        <w:br/>
-      </w:r>
-      <w:r>
-        <w:rPr>
+        <w:br/>
+      </w:r>
+      <w:r>
+        <w:rPr>
+          <w:strike/>
+        </w:rPr>
+        <w:t xml:space="preserve">FALTA </w:t>
+      </w:r>
+      <w:r>
+        <w:rPr>
+          <w:strike/>
+        </w:rPr>
+        <w:t xml:space="preserve"> </w:t>
+      </w:r>
+      <w:proofErr w:type="spellStart"/>
+      <w:r>
+        <w:rPr>
+          <w:strike/>
+        </w:rPr>
+        <w:t>btn</w:t>
+      </w:r>
+      <w:proofErr w:type="spellEnd"/>
+      <w:r>
+        <w:rPr>
+          <w:strike/>
+        </w:rPr>
+        <w:t xml:space="preserve"> descarga</w:t>
+      </w:r>
+      <w:r>
+        <w:t xml:space="preserve"> y </w:t>
+      </w:r>
+      <w:r>
+        <w:t xml:space="preserve">FALTA  las funcionalidades de filtrado y traer </w:t>
+      </w:r>
+      <w:proofErr w:type="spellStart"/>
+      <w:r>
+        <w:t>info</w:t>
+      </w:r>
+      <w:proofErr w:type="spellEnd"/>
+      <w:r>
+        <w:t xml:space="preserve"> de BBDD</w:t>
+      </w:r>
+      <w:r>
+        <w:br/>
+      </w:r>
+      <w:r>
+        <w:br/>
+      </w:r>
+      <w:r>
+        <w:br/>
+        <w:t xml:space="preserve">PAGES / </w:t>
+      </w:r>
+      <w:proofErr w:type="spellStart"/>
+      <w:r>
+        <w:t>SecciónStock</w:t>
+      </w:r>
+      <w:bookmarkStart w:id="0" w:name="_GoBack"/>
+      <w:bookmarkEnd w:id="0"/>
+      <w:proofErr w:type="spellEnd"/>
+    </w:p>
+    <w:p>
+      <w:pPr>
+        <w:pStyle w:val="Prrafodelista"/>
+        <w:ind w:left="644"/>
+      </w:pPr>
+    </w:p>
+    <w:p>
+      <w:pPr>
+        <w:pStyle w:val="Prrafodelista"/>
+        <w:numPr>
+          <w:ilvl w:val="0"/>
+          <w:numId w:val="1"/>
+        </w:numPr>
+      </w:pPr>
+      <w:r>
+        <w:rPr>
+          <w:b/>
+        </w:rPr>
+        <w:t>stock</w:t>
+      </w:r>
+      <w:r>
+        <w:t>.js</w:t>
+      </w:r>
+    </w:p>
+    <w:p>
+      <w:pPr>
+        <w:pStyle w:val="Prrafodelista"/>
+        <w:numPr>
+          <w:ilvl w:val="0"/>
+          <w:numId w:val="2"/>
+        </w:numPr>
+      </w:pPr>
+      <w:r>
+        <w:rPr>
+          <w:strike/>
+        </w:rPr>
+        <w:t xml:space="preserve">Poner </w:t>
+      </w:r>
+      <w:proofErr w:type="spellStart"/>
+      <w:r>
+        <w:rPr>
+          <w:strike/>
+        </w:rPr>
+        <w:t>btn</w:t>
+      </w:r>
+      <w:proofErr w:type="spellEnd"/>
+      <w:r>
+        <w:rPr>
+          <w:strike/>
+        </w:rPr>
+        <w:t xml:space="preserve"> de </w:t>
+      </w:r>
+      <w:proofErr w:type="spellStart"/>
+      <w:r>
+        <w:rPr>
+          <w:strike/>
+        </w:rPr>
+        <w:t>decargar</w:t>
+      </w:r>
+      <w:proofErr w:type="spellEnd"/>
+      <w:r>
+        <w:rPr>
+          <w:strike/>
+        </w:rPr>
+        <w:t xml:space="preserve"> en el </w:t>
+      </w:r>
+      <w:proofErr w:type="spellStart"/>
+      <w:r>
+        <w:rPr>
+          <w:strike/>
+        </w:rPr>
+        <w:t>footer</w:t>
+      </w:r>
+      <w:proofErr w:type="spellEnd"/>
+      <w:r>
+        <w:rPr>
+          <w:strike/>
+        </w:rPr>
+        <w:t xml:space="preserve"> abajo a la derecha</w:t>
+      </w:r>
+      <w:r>
+        <w:rPr>
+          <w:strike/>
+        </w:rPr>
+        <w:br/>
+      </w:r>
+      <w:r>
+        <w:rPr>
+          <w:strike/>
+        </w:rPr>
+        <w:t>(El icono debe ser como el de las VentasPorVendedor.js)</w:t>
+      </w:r>
+    </w:p>
+    <w:p>
+      <w:pPr>
+        <w:pStyle w:val="Prrafodelista"/>
+        <w:numPr>
+          <w:ilvl w:val="0"/>
+          <w:numId w:val="2"/>
+        </w:numPr>
+        <w:rPr>
+          <w:strike/>
+        </w:rPr>
+      </w:pPr>
+      <w:r>
+        <w:rPr>
+          <w:strike/>
+        </w:rPr>
+        <w:t xml:space="preserve">Agregar Notificaciones para descarga exitosa o error </w:t>
+      </w:r>
+    </w:p>
+    <w:p>
+      <w:pPr>
+        <w:pStyle w:val="Prrafodelista"/>
+        <w:numPr>
+          <w:ilvl w:val="0"/>
+          <w:numId w:val="2"/>
+        </w:numPr>
+      </w:pPr>
+      <w:r>
+        <w:t>Traer stock automáticamente desde BBDD</w:t>
+      </w:r>
+    </w:p>
+    <w:p>
+      <w:pPr>
+        <w:pStyle w:val="Prrafodelista"/>
+        <w:numPr>
+          <w:ilvl w:val="0"/>
+          <w:numId w:val="2"/>
+        </w:numPr>
+      </w:pPr>
+      <w:r>
+        <w:t>La lupa me deja traer el producto pero no lee la cantidad que hay en stock</w:t>
+      </w:r>
+    </w:p>
+    <w:p>
+      <w:pPr>
+        <w:pStyle w:val="Prrafodelista"/>
+        <w:ind w:left="1080"/>
+      </w:pPr>
+    </w:p>
+    <w:p>
+      <w:pPr>
+        <w:pStyle w:val="Prrafodelista"/>
+        <w:numPr>
+          <w:ilvl w:val="0"/>
+          <w:numId w:val="1"/>
+        </w:numPr>
+        <w:rPr>
+          <w:highlight w:val="green"/>
+        </w:rPr>
+      </w:pPr>
+      <w:r>
+        <w:rPr>
+          <w:b/>
+          <w:highlight w:val="green"/>
+        </w:rPr>
+        <w:t>cargandoRemitoNro</w:t>
+      </w:r>
+      <w:r>
+        <w:rPr>
+          <w:highlight w:val="green"/>
+        </w:rPr>
+        <w:t>.js:</w:t>
+      </w:r>
+    </w:p>
+    <w:p>
+      <w:pPr>
+        <w:pStyle w:val="Prrafodelista"/>
+        <w:ind w:left="644"/>
+        <w:rPr>
+          <w:b/>
+        </w:rPr>
+      </w:pPr>
+      <w:r>
+        <w:rPr>
+          <w:b/>
+        </w:rPr>
+        <w:lastRenderedPageBreak/>
+        <w:t xml:space="preserve">En mi PC se ve </w:t>
+      </w:r>
+      <w:r>
+        <w:rPr>
+          <w:b/>
+        </w:rPr>
+        <w:t>así:</w:t>
+      </w:r>
+      <w:r>
+        <w:rPr>
+          <w:b/>
+        </w:rPr>
+        <w:br/>
+      </w:r>
+      <w:r>
+        <w:rPr>
+          <w:b/>
           <w:noProof/>
           <w:lang w:eastAsia="es-AR"/>
         </w:rPr>
-        <w:lastRenderedPageBreak/>
         <w:drawing>
-          <wp:inline distT="0" distB="0" distL="0" distR="0" wp14:anchorId="2F2141F6" wp14:editId="29EC4B11">
-            <wp:extent cx="1447800" cy="3178629"/>
-            <wp:effectExtent l="0" t="0" r="0" b="3175"/>
-            <wp:docPr id="6" name="Imagen 6"/>
+          <wp:inline distT="0" distB="0" distL="0" distR="0" wp14:anchorId="2B78FC63" wp14:editId="6C3C4F83">
+            <wp:extent cx="2012950" cy="2652502"/>
+            <wp:effectExtent l="0" t="0" r="6350" b="0"/>
+            <wp:docPr id="8" name="Imagen 8"/>
             <wp:cNvGraphicFramePr>
               <a:graphicFrameLocks xmlns:a="http://schemas.openxmlformats.org/drawingml/2006/main" noChangeAspect="1"/>
             </wp:cNvGraphicFramePr>
@@ -1342,7 +1617,7 @@
                   <pic:spPr>
                     <a:xfrm>
                       <a:off x="0" y="0"/>
-                      <a:ext cx="1448643" cy="3180479"/>
+                      <a:ext cx="2013039" cy="2652620"/>
                     </a:xfrm>
                     <a:prstGeom prst="rect">
                       <a:avLst/>
@@ -1355,227 +1630,17 @@
         </w:drawing>
       </w:r>
       <w:r>
-        <w:br/>
-      </w:r>
-      <w:r>
-        <w:br/>
-      </w:r>
-      <w:r>
-        <w:rPr>
-          <w:strike/>
-        </w:rPr>
-        <w:t xml:space="preserve">FALTA </w:t>
-      </w:r>
-      <w:r>
-        <w:rPr>
-          <w:strike/>
-        </w:rPr>
-        <w:t xml:space="preserve"> </w:t>
-      </w:r>
-      <w:proofErr w:type="spellStart"/>
-      <w:r>
-        <w:rPr>
-          <w:strike/>
-        </w:rPr>
-        <w:t>btn</w:t>
-      </w:r>
-      <w:proofErr w:type="spellEnd"/>
-      <w:r>
-        <w:rPr>
-          <w:strike/>
-        </w:rPr>
-        <w:t xml:space="preserve"> descarga</w:t>
-      </w:r>
-      <w:r>
-        <w:t xml:space="preserve"> y </w:t>
-      </w:r>
-      <w:r>
-        <w:t xml:space="preserve">FALTA  </w:t>
-      </w:r>
-      <w:r>
-        <w:t xml:space="preserve">las funcionalidades de filtrado y traer </w:t>
-      </w:r>
-      <w:proofErr w:type="spellStart"/>
-      <w:r>
-        <w:t>info</w:t>
-      </w:r>
-      <w:proofErr w:type="spellEnd"/>
-      <w:r>
-        <w:t xml:space="preserve"> de BBDD</w:t>
-      </w:r>
-      <w:r>
-        <w:br/>
-      </w:r>
-      <w:r>
-        <w:br/>
-      </w:r>
-      <w:r>
-        <w:br/>
-        <w:t xml:space="preserve">PAGES / </w:t>
-      </w:r>
-      <w:proofErr w:type="spellStart"/>
-      <w:r>
-        <w:t>SecciónStock</w:t>
-      </w:r>
-      <w:proofErr w:type="spellEnd"/>
-    </w:p>
-    <w:p>
-      <w:pPr>
-        <w:pStyle w:val="Prrafodelista"/>
-        <w:ind w:left="644"/>
-      </w:pPr>
-    </w:p>
-    <w:p>
-      <w:pPr>
-        <w:pStyle w:val="Prrafodelista"/>
-        <w:numPr>
-          <w:ilvl w:val="0"/>
-          <w:numId w:val="1"/>
-        </w:numPr>
-      </w:pPr>
-      <w:r>
-        <w:rPr>
-          <w:b/>
-        </w:rPr>
-        <w:t>stock</w:t>
-      </w:r>
-      <w:r>
-        <w:t>.js</w:t>
-      </w:r>
-      <w:bookmarkStart w:id="0" w:name="_GoBack"/>
-      <w:bookmarkEnd w:id="0"/>
-    </w:p>
-    <w:p>
-      <w:pPr>
-        <w:pStyle w:val="Prrafodelista"/>
-        <w:numPr>
-          <w:ilvl w:val="0"/>
-          <w:numId w:val="2"/>
-        </w:numPr>
-      </w:pPr>
-      <w:r>
-        <w:t xml:space="preserve">Poner </w:t>
-      </w:r>
-      <w:proofErr w:type="spellStart"/>
-      <w:r>
-        <w:t>btn</w:t>
-      </w:r>
-      <w:proofErr w:type="spellEnd"/>
-      <w:r>
-        <w:t xml:space="preserve"> de </w:t>
-      </w:r>
-      <w:proofErr w:type="spellStart"/>
-      <w:r>
-        <w:t>decargar</w:t>
-      </w:r>
-      <w:proofErr w:type="spellEnd"/>
-      <w:r>
-        <w:t xml:space="preserve"> en el </w:t>
-      </w:r>
-      <w:proofErr w:type="spellStart"/>
-      <w:r>
-        <w:t>footer</w:t>
-      </w:r>
-      <w:proofErr w:type="spellEnd"/>
-      <w:r>
-        <w:t xml:space="preserve"> abajo a la derecha</w:t>
-      </w:r>
-      <w:r>
-        <w:br/>
-      </w:r>
-      <w:r>
-        <w:rPr>
-          <w:strike/>
-        </w:rPr>
-        <w:t>(El icono debe ser como el de las VentasPorVendedor.js)</w:t>
-      </w:r>
-    </w:p>
-    <w:p>
-      <w:pPr>
-        <w:pStyle w:val="Prrafodelista"/>
-        <w:numPr>
-          <w:ilvl w:val="0"/>
-          <w:numId w:val="2"/>
-        </w:numPr>
-      </w:pPr>
-      <w:r>
-        <w:t xml:space="preserve">Agregar Notificaciones para descarga exitosa o error </w:t>
-      </w:r>
-    </w:p>
-    <w:p>
-      <w:pPr>
-        <w:pStyle w:val="Prrafodelista"/>
-        <w:numPr>
-          <w:ilvl w:val="0"/>
-          <w:numId w:val="2"/>
-        </w:numPr>
-      </w:pPr>
-      <w:r>
-        <w:t>Traer stock automáticamente desde BBDD</w:t>
-      </w:r>
-    </w:p>
-    <w:p>
-      <w:pPr>
-        <w:pStyle w:val="Prrafodelista"/>
-        <w:numPr>
-          <w:ilvl w:val="0"/>
-          <w:numId w:val="2"/>
-        </w:numPr>
-      </w:pPr>
-      <w:r>
-        <w:t>La lupa me deja traer el producto pero no lee la cantidad que hay en stock</w:t>
-      </w:r>
-    </w:p>
-    <w:p>
-      <w:pPr>
-        <w:pStyle w:val="Prrafodelista"/>
-        <w:ind w:left="1080"/>
-      </w:pPr>
-    </w:p>
-    <w:p>
-      <w:pPr>
-        <w:pStyle w:val="Prrafodelista"/>
-        <w:numPr>
-          <w:ilvl w:val="0"/>
-          <w:numId w:val="1"/>
-        </w:numPr>
-        <w:rPr>
-          <w:highlight w:val="green"/>
-        </w:rPr>
-      </w:pPr>
-      <w:r>
-        <w:rPr>
-          <w:b/>
-          <w:highlight w:val="green"/>
-        </w:rPr>
-        <w:t>cargandoRemitoNro</w:t>
-      </w:r>
-      <w:r>
-        <w:rPr>
-          <w:highlight w:val="green"/>
-        </w:rPr>
-        <w:t>.js:</w:t>
-      </w:r>
-    </w:p>
-    <w:p>
-      <w:pPr>
-        <w:pStyle w:val="Prrafodelista"/>
-        <w:ind w:left="644"/>
-        <w:rPr>
-          <w:b/>
-        </w:rPr>
-      </w:pPr>
-      <w:r>
-        <w:rPr>
-          <w:b/>
-        </w:rPr>
-        <w:t xml:space="preserve">En mi PC se ve </w:t>
-      </w:r>
-      <w:r>
-        <w:rPr>
-          <w:b/>
-        </w:rPr>
-        <w:t>así:</w:t>
+        <w:rPr>
+          <w:b/>
+        </w:rPr>
+        <w:br/>
+      </w:r>
+      <w:r>
+        <w:rPr>
+          <w:b/>
+        </w:rPr>
+        <w:br/>
+        <w:t>Así debería verse estos:</w:t>
       </w:r>
       <w:r>
         <w:rPr>
@@ -1590,10 +1655,10 @@
           <w:lang w:eastAsia="es-AR"/>
         </w:rPr>
         <w:drawing>
-          <wp:inline distT="0" distB="0" distL="0" distR="0" wp14:anchorId="2B78FC63" wp14:editId="6C3C4F83">
-            <wp:extent cx="2012950" cy="2652502"/>
-            <wp:effectExtent l="0" t="0" r="6350" b="0"/>
-            <wp:docPr id="8" name="Imagen 8"/>
+          <wp:inline distT="0" distB="0" distL="0" distR="0" wp14:anchorId="76D15F07" wp14:editId="2388332C">
+            <wp:extent cx="5612130" cy="3841115"/>
+            <wp:effectExtent l="0" t="0" r="7620" b="6985"/>
+            <wp:docPr id="12" name="Imagen 12"/>
             <wp:cNvGraphicFramePr>
               <a:graphicFrameLocks xmlns:a="http://schemas.openxmlformats.org/drawingml/2006/main" noChangeAspect="1"/>
             </wp:cNvGraphicFramePr>
@@ -1613,7 +1678,7 @@
                   <pic:spPr>
                     <a:xfrm>
                       <a:off x="0" y="0"/>
-                      <a:ext cx="2013039" cy="2652620"/>
+                      <a:ext cx="5612130" cy="3841115"/>
                     </a:xfrm>
                     <a:prstGeom prst="rect">
                       <a:avLst/>
@@ -1625,42 +1690,27 @@
           </wp:inline>
         </w:drawing>
       </w:r>
-      <w:r>
-        <w:rPr>
-          <w:b/>
-        </w:rPr>
-        <w:br/>
-      </w:r>
-      <w:r>
-        <w:rPr>
-          <w:b/>
-        </w:rPr>
-        <w:br/>
-      </w:r>
-      <w:r>
-        <w:rPr>
-          <w:b/>
-        </w:rPr>
-        <w:lastRenderedPageBreak/>
-        <w:t>Así debería verse estos:</w:t>
-      </w:r>
-      <w:r>
-        <w:rPr>
-          <w:b/>
-        </w:rPr>
-        <w:br/>
-      </w:r>
+    </w:p>
+    <w:p>
+      <w:pPr>
+        <w:pStyle w:val="Prrafodelista"/>
+        <w:ind w:left="644"/>
+        <w:rPr>
+          <w:b/>
+        </w:rPr>
+      </w:pPr>
       <w:r>
         <w:rPr>
           <w:b/>
           <w:noProof/>
           <w:lang w:eastAsia="es-AR"/>
         </w:rPr>
+        <w:lastRenderedPageBreak/>
         <w:drawing>
-          <wp:inline distT="0" distB="0" distL="0" distR="0" wp14:anchorId="76D15F07" wp14:editId="2388332C">
-            <wp:extent cx="5612130" cy="3841115"/>
-            <wp:effectExtent l="0" t="0" r="7620" b="6985"/>
-            <wp:docPr id="12" name="Imagen 12"/>
+          <wp:inline distT="0" distB="0" distL="0" distR="0" wp14:anchorId="6BACA242" wp14:editId="328D3177">
+            <wp:extent cx="1905266" cy="4086796"/>
+            <wp:effectExtent l="0" t="0" r="0" b="9525"/>
+            <wp:docPr id="14" name="Imagen 14"/>
             <wp:cNvGraphicFramePr>
               <a:graphicFrameLocks xmlns:a="http://schemas.openxmlformats.org/drawingml/2006/main" noChangeAspect="1"/>
             </wp:cNvGraphicFramePr>
@@ -1680,57 +1730,6 @@
                   <pic:spPr>
                     <a:xfrm>
                       <a:off x="0" y="0"/>
-                      <a:ext cx="5612130" cy="3841115"/>
-                    </a:xfrm>
-                    <a:prstGeom prst="rect">
-                      <a:avLst/>
-                    </a:prstGeom>
-                  </pic:spPr>
-                </pic:pic>
-              </a:graphicData>
-            </a:graphic>
-          </wp:inline>
-        </w:drawing>
-      </w:r>
-    </w:p>
-    <w:p>
-      <w:pPr>
-        <w:pStyle w:val="Prrafodelista"/>
-        <w:ind w:left="644"/>
-        <w:rPr>
-          <w:b/>
-        </w:rPr>
-      </w:pPr>
-      <w:r>
-        <w:rPr>
-          <w:b/>
-          <w:noProof/>
-          <w:lang w:eastAsia="es-AR"/>
-        </w:rPr>
-        <w:drawing>
-          <wp:inline distT="0" distB="0" distL="0" distR="0" wp14:anchorId="6BACA242" wp14:editId="328D3177">
-            <wp:extent cx="1905266" cy="4086796"/>
-            <wp:effectExtent l="0" t="0" r="0" b="9525"/>
-            <wp:docPr id="14" name="Imagen 14"/>
-            <wp:cNvGraphicFramePr>
-              <a:graphicFrameLocks xmlns:a="http://schemas.openxmlformats.org/drawingml/2006/main" noChangeAspect="1"/>
-            </wp:cNvGraphicFramePr>
-            <a:graphic xmlns:a="http://schemas.openxmlformats.org/drawingml/2006/main">
-              <a:graphicData uri="http://schemas.openxmlformats.org/drawingml/2006/picture">
-                <pic:pic xmlns:pic="http://schemas.openxmlformats.org/drawingml/2006/picture">
-                  <pic:nvPicPr>
-                    <pic:cNvPr id="0" name=""/>
-                    <pic:cNvPicPr/>
-                  </pic:nvPicPr>
-                  <pic:blipFill>
-                    <a:blip r:embed="rId15"/>
-                    <a:stretch>
-                      <a:fillRect/>
-                    </a:stretch>
-                  </pic:blipFill>
-                  <pic:spPr>
-                    <a:xfrm>
-                      <a:off x="0" y="0"/>
                       <a:ext cx="1905266" cy="4086796"/>
                     </a:xfrm>
                     <a:prstGeom prst="rect">
@@ -1771,9 +1770,18 @@
         <w:br/>
       </w:r>
       <w:r>
-        <w:t xml:space="preserve">a) </w:t>
-      </w:r>
-      <w:r>
+        <w:t>a</w:t>
+      </w:r>
+      <w:r>
+        <w:rPr>
+          <w:highlight w:val="yellow"/>
+        </w:rPr>
+        <w:t xml:space="preserve">) </w:t>
+      </w:r>
+      <w:r>
+        <w:rPr>
+          <w:highlight w:val="yellow"/>
+        </w:rPr>
         <w:t>Cuando se presiona Cancel, debería limpiarse el precio de venta.</w:t>
       </w:r>
       <w:r>
@@ -1822,12 +1830,21 @@
       </w:r>
       <w:proofErr w:type="spellEnd"/>
       <w:r>
-        <w:t xml:space="preserve"> para que el usuario edite lo que quiera</w:t>
-      </w:r>
-      <w:r>
-        <w:br/>
-      </w:r>
-      <w:r>
+        <w:t xml:space="preserve"> </w:t>
+      </w:r>
+      <w:r>
+        <w:t xml:space="preserve">desde BBDD, </w:t>
+      </w:r>
+      <w:r>
+        <w:t>para que el usuario edite lo que quiera</w:t>
+      </w:r>
+      <w:r>
+        <w:br/>
+      </w:r>
+      <w:r>
+        <w:rPr>
+          <w:highlight w:val="yellow"/>
+        </w:rPr>
         <w:t>Agregar cartel de “Guardado Exitoso”</w:t>
       </w:r>
       <w:r>
@@ -1846,7 +1863,6 @@
         <w:rPr>
           <w:b/>
         </w:rPr>
-        <w:lastRenderedPageBreak/>
         <w:t>eliminarProducto</w:t>
       </w:r>
       <w:r>
@@ -1861,6 +1877,9 @@
       <w:r>
         <w:br/>
         <w:t>Falta función para eliminar el producto</w:t>
+      </w:r>
+      <w:r>
+        <w:t xml:space="preserve"> de la BBDD</w:t>
       </w:r>
       <w:r>
         <w:br/>
@@ -1911,7 +1930,7 @@
                     <pic:cNvPicPr/>
                   </pic:nvPicPr>
                   <pic:blipFill>
-                    <a:blip r:embed="rId16">
+                    <a:blip r:embed="rId15">
                       <a:extLst>
                         <a:ext uri="{28A0092B-C50C-407E-A947-70E740481C1C}">
                           <a14:useLocalDpi xmlns:a14="http://schemas.microsoft.com/office/drawing/2010/main" val="0"/>
@@ -2098,6 +2117,7 @@
         </w:numPr>
       </w:pPr>
       <w:r>
+        <w:lastRenderedPageBreak/>
         <w:t>Al presionar</w:t>
       </w:r>
       <w:r>
@@ -2146,7 +2166,7 @@
                     <pic:cNvPicPr/>
                   </pic:nvPicPr>
                   <pic:blipFill>
-                    <a:blip r:embed="rId17"/>
+                    <a:blip r:embed="rId16"/>
                     <a:stretch>
                       <a:fillRect/>
                     </a:stretch>
@@ -2211,7 +2231,6 @@
           <w:noProof/>
           <w:lang w:eastAsia="es-AR"/>
         </w:rPr>
-        <w:lastRenderedPageBreak/>
         <w:drawing>
           <wp:inline distT="0" distB="0" distL="0" distR="0" wp14:anchorId="599FBF1C" wp14:editId="60737FA5">
             <wp:extent cx="1551007" cy="3314761"/>
@@ -2228,7 +2247,7 @@
                     <pic:cNvPicPr/>
                   </pic:nvPicPr>
                   <pic:blipFill>
-                    <a:blip r:embed="rId18"/>
+                    <a:blip r:embed="rId17"/>
                     <a:stretch>
                       <a:fillRect/>
                     </a:stretch>

</xml_diff>